<commit_message>
start claude free addedd
</commit_message>
<xml_diff>
--- a/reports/fttp_tc_acq/fttp_tc_acq.docx
+++ b/reports/fttp_tc_acq/fttp_tc_acq.docx
@@ -20,14 +20,14 @@
     </w:p>
     <w:p>
       <w:r>
-        <w:t>Timestamp: 2026-10-11 22:57:14</w:t>
+        <w:t>Timestamp: 2026-10-30 00:19:37</w:t>
       </w:r>
     </w:p>
     <w:p>
       <w:r>
         <w:drawing>
           <wp:inline xmlns:a="http://schemas.openxmlformats.org/drawingml/2006/main" xmlns:pic="http://schemas.openxmlformats.org/drawingml/2006/picture">
-            <wp:extent cx="5029200" cy="7931427"/>
+            <wp:extent cx="5029200" cy="7935402"/>
             <wp:docPr id="1" name="Picture 1"/>
             <wp:cNvGraphicFramePr>
               <a:graphicFrameLocks noChangeAspect="1"/>
@@ -36,7 +36,7 @@
               <a:graphicData uri="http://schemas.openxmlformats.org/drawingml/2006/picture">
                 <pic:pic>
                   <pic:nvPicPr>
-                    <pic:cNvPr id="0" name="01_landing_page_availability_clicked_2026-10-11_22-57-14.png"/>
+                    <pic:cNvPr id="0" name="01_landing_page_availability_clicked_2026-10-30_00-19-37.png"/>
                     <pic:cNvPicPr/>
                   </pic:nvPicPr>
                   <pic:blipFill>
@@ -48,7 +48,7 @@
                   <pic:spPr>
                     <a:xfrm>
                       <a:off x="0" y="0"/>
-                      <a:ext cx="5029200" cy="7931427"/>
+                      <a:ext cx="5029200" cy="7935402"/>
                     </a:xfrm>
                     <a:prstGeom prst="rect"/>
                   </pic:spPr>
@@ -69,14 +69,14 @@
     </w:p>
     <w:p>
       <w:r>
-        <w:t>Timestamp: 2026-10-11 22:57:21</w:t>
+        <w:t>Timestamp: 2026-10-30 00:19:42</w:t>
       </w:r>
     </w:p>
     <w:p>
       <w:r>
         <w:drawing>
           <wp:inline xmlns:a="http://schemas.openxmlformats.org/drawingml/2006/main" xmlns:pic="http://schemas.openxmlformats.org/drawingml/2006/picture">
-            <wp:extent cx="5029200" cy="9211587"/>
+            <wp:extent cx="5029200" cy="9215562"/>
             <wp:docPr id="2" name="Picture 2"/>
             <wp:cNvGraphicFramePr>
               <a:graphicFrameLocks noChangeAspect="1"/>
@@ -85,7 +85,7 @@
               <a:graphicData uri="http://schemas.openxmlformats.org/drawingml/2006/picture">
                 <pic:pic>
                   <pic:nvPicPr>
-                    <pic:cNvPr id="0" name="02_address_page_recently_moved_selected_2026-10-11_22-57-21.png"/>
+                    <pic:cNvPr id="0" name="02_address_page_recently_moved_selected_2026-10-30_00-19-42.png"/>
                     <pic:cNvPicPr/>
                   </pic:nvPicPr>
                   <pic:blipFill>
@@ -97,7 +97,7 @@
                   <pic:spPr>
                     <a:xfrm>
                       <a:off x="0" y="0"/>
-                      <a:ext cx="5029200" cy="9211587"/>
+                      <a:ext cx="5029200" cy="9215562"/>
                     </a:xfrm>
                     <a:prstGeom prst="rect"/>
                   </pic:spPr>
@@ -118,14 +118,14 @@
     </w:p>
     <w:p>
       <w:r>
-        <w:t>Timestamp: 2026-10-11 22:57:28</w:t>
+        <w:t>Timestamp: 2026-10-30 00:19:48</w:t>
       </w:r>
     </w:p>
     <w:p>
       <w:r>
         <w:drawing>
           <wp:inline xmlns:a="http://schemas.openxmlformats.org/drawingml/2006/main" xmlns:pic="http://schemas.openxmlformats.org/drawingml/2006/picture">
-            <wp:extent cx="5029200" cy="8193820"/>
+            <wp:extent cx="5029200" cy="8197795"/>
             <wp:docPr id="3" name="Picture 3"/>
             <wp:cNvGraphicFramePr>
               <a:graphicFrameLocks noChangeAspect="1"/>
@@ -134,7 +134,7 @@
               <a:graphicData uri="http://schemas.openxmlformats.org/drawingml/2006/picture">
                 <pic:pic>
                   <pic:nvPicPr>
-                    <pic:cNvPr id="0" name="03_address_page_view_broadband_plans_2026-10-11_22-57-28.png"/>
+                    <pic:cNvPr id="0" name="03_address_page_view_broadband_plans_2026-10-30_00-19-48.png"/>
                     <pic:cNvPicPr/>
                   </pic:nvPicPr>
                   <pic:blipFill>
@@ -146,7 +146,7 @@
                   <pic:spPr>
                     <a:xfrm>
                       <a:off x="0" y="0"/>
-                      <a:ext cx="5029200" cy="8193820"/>
+                      <a:ext cx="5029200" cy="8197795"/>
                     </a:xfrm>
                     <a:prstGeom prst="rect"/>
                   </pic:spPr>
@@ -167,14 +167,14 @@
     </w:p>
     <w:p>
       <w:r>
-        <w:t>Timestamp: 2026-10-11 22:57:37</w:t>
+        <w:t>Timestamp: 2026-10-30 00:19:53</w:t>
       </w:r>
     </w:p>
     <w:p>
       <w:r>
         <w:drawing>
           <wp:inline xmlns:a="http://schemas.openxmlformats.org/drawingml/2006/main" xmlns:pic="http://schemas.openxmlformats.org/drawingml/2006/picture">
-            <wp:extent cx="5029200" cy="12988456"/>
+            <wp:extent cx="5029200" cy="12885089"/>
             <wp:docPr id="4" name="Picture 4"/>
             <wp:cNvGraphicFramePr>
               <a:graphicFrameLocks noChangeAspect="1"/>
@@ -183,7 +183,7 @@
               <a:graphicData uri="http://schemas.openxmlformats.org/drawingml/2006/picture">
                 <pic:pic>
                   <pic:nvPicPr>
-                    <pic:cNvPr id="0" name="04_plans_page_speed_selected_2026-10-11_22-57-37.png"/>
+                    <pic:cNvPr id="0" name="04_plans_page_speed_selected_2026-10-30_00-19-53.png"/>
                     <pic:cNvPicPr/>
                   </pic:nvPicPr>
                   <pic:blipFill>
@@ -195,7 +195,7 @@
                   <pic:spPr>
                     <a:xfrm>
                       <a:off x="0" y="0"/>
-                      <a:ext cx="5029200" cy="12988456"/>
+                      <a:ext cx="5029200" cy="12885089"/>
                     </a:xfrm>
                     <a:prstGeom prst="rect"/>
                   </pic:spPr>
@@ -216,7 +216,7 @@
     </w:p>
     <w:p>
       <w:r>
-        <w:t>Timestamp: 2026-10-11 22:57:55</w:t>
+        <w:t>Timestamp: 2026-10-30 00:20:11</w:t>
       </w:r>
     </w:p>
     <w:p>
@@ -232,7 +232,7 @@
               <a:graphicData uri="http://schemas.openxmlformats.org/drawingml/2006/picture">
                 <pic:pic>
                   <pic:nvPicPr>
-                    <pic:cNvPr id="0" name="05_plans_page_broadband_plan_selected_2026-10-11_22-57-55.png"/>
+                    <pic:cNvPr id="0" name="05_plans_page_broadband_plan_selected_2026-10-30_00-20-11.png"/>
                     <pic:cNvPicPr/>
                   </pic:nvPicPr>
                   <pic:blipFill>
@@ -265,7 +265,7 @@
     </w:p>
     <w:p>
       <w:r>
-        <w:t>Timestamp: 2026-10-11 22:58:04</w:t>
+        <w:t>Timestamp: 2026-10-30 00:20:18</w:t>
       </w:r>
     </w:p>
     <w:p>
@@ -281,7 +281,7 @@
               <a:graphicData uri="http://schemas.openxmlformats.org/drawingml/2006/picture">
                 <pic:pic>
                   <pic:nvPicPr>
-                    <pic:cNvPr id="0" name="06_addon_page_continue_to_setup_2026-10-11_22-58-04.png"/>
+                    <pic:cNvPr id="0" name="06_addon_page_continue_to_setup_2026-10-30_00-20-18.png"/>
                     <pic:cNvPicPr/>
                   </pic:nvPicPr>
                   <pic:blipFill>
@@ -314,7 +314,7 @@
     </w:p>
     <w:p>
       <w:r>
-        <w:t>Timestamp: 2026-10-11 22:58:08</w:t>
+        <w:t>Timestamp: 2026-10-30 00:20:22</w:t>
       </w:r>
     </w:p>
     <w:p>
@@ -330,7 +330,7 @@
               <a:graphicData uri="http://schemas.openxmlformats.org/drawingml/2006/picture">
                 <pic:pic>
                   <pic:nvPicPr>
-                    <pic:cNvPr id="0" name="07_setup_page_telecare_checked_2026-10-11_22-58-08.png"/>
+                    <pic:cNvPr id="0" name="07_setup_page_telecare_checked_2026-10-30_00-20-22.png"/>
                     <pic:cNvPicPr/>
                   </pic:nvPicPr>
                   <pic:blipFill>
@@ -363,14 +363,14 @@
     </w:p>
     <w:p>
       <w:r>
-        <w:t>Timestamp: 2026-10-11 22:58:15</w:t>
+        <w:t>Timestamp: 2026-10-30 00:20:29</w:t>
       </w:r>
     </w:p>
     <w:p>
       <w:r>
         <w:drawing>
           <wp:inline xmlns:a="http://schemas.openxmlformats.org/drawingml/2006/main" xmlns:pic="http://schemas.openxmlformats.org/drawingml/2006/picture">
-            <wp:extent cx="5029200" cy="8897510"/>
+            <wp:extent cx="5029200" cy="9024731"/>
             <wp:docPr id="8" name="Picture 8"/>
             <wp:cNvGraphicFramePr>
               <a:graphicFrameLocks noChangeAspect="1"/>
@@ -379,7 +379,7 @@
               <a:graphicData uri="http://schemas.openxmlformats.org/drawingml/2006/picture">
                 <pic:pic>
                   <pic:nvPicPr>
-                    <pic:cNvPr id="0" name="08_setup_page_go_to_basket_2026-10-11_22-58-15.png"/>
+                    <pic:cNvPr id="0" name="08_setup_page_go_to_basket_2026-10-30_00-20-29.png"/>
                     <pic:cNvPicPr/>
                   </pic:nvPicPr>
                   <pic:blipFill>
@@ -391,7 +391,7 @@
                   <pic:spPr>
                     <a:xfrm>
                       <a:off x="0" y="0"/>
-                      <a:ext cx="5029200" cy="8897510"/>
+                      <a:ext cx="5029200" cy="9024731"/>
                     </a:xfrm>
                     <a:prstGeom prst="rect"/>
                   </pic:spPr>
@@ -412,14 +412,14 @@
     </w:p>
     <w:p>
       <w:r>
-        <w:t>Timestamp: 2026-10-11 22:58:24</w:t>
+        <w:t>Timestamp: 2026-10-30 00:20:35</w:t>
       </w:r>
     </w:p>
     <w:p>
       <w:r>
         <w:drawing>
           <wp:inline xmlns:a="http://schemas.openxmlformats.org/drawingml/2006/main" xmlns:pic="http://schemas.openxmlformats.org/drawingml/2006/picture">
-            <wp:extent cx="5029200" cy="12908943"/>
+            <wp:extent cx="5029200" cy="13032189"/>
             <wp:docPr id="9" name="Picture 9"/>
             <wp:cNvGraphicFramePr>
               <a:graphicFrameLocks noChangeAspect="1"/>
@@ -428,7 +428,7 @@
               <a:graphicData uri="http://schemas.openxmlformats.org/drawingml/2006/picture">
                 <pic:pic>
                   <pic:nvPicPr>
-                    <pic:cNvPr id="0" name="09_basket_page_basket_expanded_2026-10-11_22-58-24.png"/>
+                    <pic:cNvPr id="0" name="09_basket_page_basket_expanded_2026-10-30_00-20-35.png"/>
                     <pic:cNvPicPr/>
                   </pic:nvPicPr>
                   <pic:blipFill>
@@ -440,7 +440,7 @@
                   <pic:spPr>
                     <a:xfrm>
                       <a:off x="0" y="0"/>
-                      <a:ext cx="5029200" cy="12908943"/>
+                      <a:ext cx="5029200" cy="13032189"/>
                     </a:xfrm>
                     <a:prstGeom prst="rect"/>
                   </pic:spPr>
@@ -461,14 +461,14 @@
     </w:p>
     <w:p>
       <w:r>
-        <w:t>Timestamp: 2026-10-11 22:58:26</w:t>
+        <w:t>Timestamp: 2026-10-30 00:20:37</w:t>
       </w:r>
     </w:p>
     <w:p>
       <w:r>
         <w:drawing>
           <wp:inline xmlns:a="http://schemas.openxmlformats.org/drawingml/2006/main" xmlns:pic="http://schemas.openxmlformats.org/drawingml/2006/picture">
-            <wp:extent cx="5029200" cy="12761595"/>
+            <wp:extent cx="5029200" cy="12883396"/>
             <wp:docPr id="10" name="Picture 10"/>
             <wp:cNvGraphicFramePr>
               <a:graphicFrameLocks noChangeAspect="1"/>
@@ -477,7 +477,7 @@
               <a:graphicData uri="http://schemas.openxmlformats.org/drawingml/2006/picture">
                 <pic:pic>
                   <pic:nvPicPr>
-                    <pic:cNvPr id="0" name="10_basket_page_basket_validated_2026-10-11_22-58-26.png"/>
+                    <pic:cNvPr id="0" name="10_basket_page_basket_validated_2026-10-30_00-20-37.png"/>
                     <pic:cNvPicPr/>
                   </pic:nvPicPr>
                   <pic:blipFill>
@@ -489,7 +489,7 @@
                   <pic:spPr>
                     <a:xfrm>
                       <a:off x="0" y="0"/>
-                      <a:ext cx="5029200" cy="12761595"/>
+                      <a:ext cx="5029200" cy="12883396"/>
                     </a:xfrm>
                     <a:prstGeom prst="rect"/>
                   </pic:spPr>
@@ -510,14 +510,14 @@
     </w:p>
     <w:p>
       <w:r>
-        <w:t>Timestamp: 2026-10-11 22:58:33</w:t>
+        <w:t>Timestamp: 2026-10-30 00:20:44</w:t>
       </w:r>
     </w:p>
     <w:p>
       <w:r>
         <w:drawing>
           <wp:inline xmlns:a="http://schemas.openxmlformats.org/drawingml/2006/main" xmlns:pic="http://schemas.openxmlformats.org/drawingml/2006/picture">
-            <wp:extent cx="5029200" cy="8643068"/>
+            <wp:extent cx="5029200" cy="2828925"/>
             <wp:docPr id="11" name="Picture 11"/>
             <wp:cNvGraphicFramePr>
               <a:graphicFrameLocks noChangeAspect="1"/>
@@ -526,7 +526,7 @@
               <a:graphicData uri="http://schemas.openxmlformats.org/drawingml/2006/picture">
                 <pic:pic>
                   <pic:nvPicPr>
-                    <pic:cNvPr id="0" name="11_basket_page_go_to_checkout_2026-10-11_22-58-33.png"/>
+                    <pic:cNvPr id="0" name="11_basket_page_go_to_checkout_2026-10-30_00-20-44.png"/>
                     <pic:cNvPicPr/>
                   </pic:nvPicPr>
                   <pic:blipFill>
@@ -538,7 +538,7 @@
                   <pic:spPr>
                     <a:xfrm>
                       <a:off x="0" y="0"/>
-                      <a:ext cx="5029200" cy="8643068"/>
+                      <a:ext cx="5029200" cy="2828925"/>
                     </a:xfrm>
                     <a:prstGeom prst="rect"/>
                   </pic:spPr>
@@ -559,7 +559,7 @@
     </w:p>
     <w:p>
       <w:r>
-        <w:t>Timestamp: 2026-10-11 22:58:39</w:t>
+        <w:t>Timestamp: 2026-10-30 00:20:52</w:t>
       </w:r>
     </w:p>
     <w:p>
@@ -575,7 +575,7 @@
               <a:graphicData uri="http://schemas.openxmlformats.org/drawingml/2006/picture">
                 <pic:pic>
                   <pic:nvPicPr>
-                    <pic:cNvPr id="0" name="12_checkout_page_about_you_completed_2026-10-11_22-58-39.png"/>
+                    <pic:cNvPr id="0" name="12_checkout_page_about_you_completed_2026-10-30_00-20-52.png"/>
                     <pic:cNvPicPr/>
                   </pic:nvPicPr>
                   <pic:blipFill>
@@ -608,14 +608,14 @@
     </w:p>
     <w:p>
       <w:r>
-        <w:t>Timestamp: 2026-10-11 22:58:45</w:t>
+        <w:t>Timestamp: 2026-10-30 00:21:02</w:t>
       </w:r>
     </w:p>
     <w:p>
       <w:r>
         <w:drawing>
           <wp:inline xmlns:a="http://schemas.openxmlformats.org/drawingml/2006/main" xmlns:pic="http://schemas.openxmlformats.org/drawingml/2006/picture">
-            <wp:extent cx="5029200" cy="8881608"/>
+            <wp:extent cx="5029200" cy="8893534"/>
             <wp:docPr id="13" name="Picture 13"/>
             <wp:cNvGraphicFramePr>
               <a:graphicFrameLocks noChangeAspect="1"/>
@@ -624,7 +624,7 @@
               <a:graphicData uri="http://schemas.openxmlformats.org/drawingml/2006/picture">
                 <pic:pic>
                   <pic:nvPicPr>
-                    <pic:cNvPr id="0" name="13_checkout_page_address_completed_2026-10-11_22-58-45.png"/>
+                    <pic:cNvPr id="0" name="13_checkout_page_address_completed_2026-10-30_00-21-02.png"/>
                     <pic:cNvPicPr/>
                   </pic:nvPicPr>
                   <pic:blipFill>
@@ -636,7 +636,7 @@
                   <pic:spPr>
                     <a:xfrm>
                       <a:off x="0" y="0"/>
-                      <a:ext cx="5029200" cy="8881608"/>
+                      <a:ext cx="5029200" cy="8893534"/>
                     </a:xfrm>
                     <a:prstGeom prst="rect"/>
                   </pic:spPr>
@@ -657,14 +657,14 @@
     </w:p>
     <w:p>
       <w:r>
-        <w:t>Timestamp: 2026-10-11 22:58:51</w:t>
+        <w:t>Timestamp: 2026-10-30 00:21:09</w:t>
       </w:r>
     </w:p>
     <w:p>
       <w:r>
         <w:drawing>
           <wp:inline xmlns:a="http://schemas.openxmlformats.org/drawingml/2006/main" xmlns:pic="http://schemas.openxmlformats.org/drawingml/2006/picture">
-            <wp:extent cx="5029200" cy="9513736"/>
+            <wp:extent cx="5029200" cy="9525663"/>
             <wp:docPr id="14" name="Picture 14"/>
             <wp:cNvGraphicFramePr>
               <a:graphicFrameLocks noChangeAspect="1"/>
@@ -673,7 +673,7 @@
               <a:graphicData uri="http://schemas.openxmlformats.org/drawingml/2006/picture">
                 <pic:pic>
                   <pic:nvPicPr>
-                    <pic:cNvPr id="0" name="14_checkout_page_address_continue_2026-10-11_22-58-51.png"/>
+                    <pic:cNvPr id="0" name="14_checkout_page_address_continue_2026-10-30_00-21-09.png"/>
                     <pic:cNvPicPr/>
                   </pic:nvPicPr>
                   <pic:blipFill>
@@ -685,7 +685,7 @@
                   <pic:spPr>
                     <a:xfrm>
                       <a:off x="0" y="0"/>
-                      <a:ext cx="5029200" cy="9513736"/>
+                      <a:ext cx="5029200" cy="9525663"/>
                     </a:xfrm>
                     <a:prstGeom prst="rect"/>
                   </pic:spPr>
@@ -706,14 +706,14 @@
     </w:p>
     <w:p>
       <w:r>
-        <w:t>Timestamp: 2026-10-11 22:58:56</w:t>
+        <w:t>Timestamp: 2026-10-30 00:21:16</w:t>
       </w:r>
     </w:p>
     <w:p>
       <w:r>
         <w:drawing>
           <wp:inline xmlns:a="http://schemas.openxmlformats.org/drawingml/2006/main" xmlns:pic="http://schemas.openxmlformats.org/drawingml/2006/picture">
-            <wp:extent cx="5029200" cy="15600460"/>
+            <wp:extent cx="5029200" cy="15612387"/>
             <wp:docPr id="15" name="Picture 15"/>
             <wp:cNvGraphicFramePr>
               <a:graphicFrameLocks noChangeAspect="1"/>
@@ -722,7 +722,7 @@
               <a:graphicData uri="http://schemas.openxmlformats.org/drawingml/2006/picture">
                 <pic:pic>
                   <pic:nvPicPr>
-                    <pic:cNvPr id="0" name="15_checkout_page_delivery_address_selected_2026-10-11_22-58-56.png"/>
+                    <pic:cNvPr id="0" name="15_checkout_page_delivery_address_selected_2026-10-30_00-21-16.png"/>
                     <pic:cNvPicPr/>
                   </pic:nvPicPr>
                   <pic:blipFill>
@@ -734,7 +734,7 @@
                   <pic:spPr>
                     <a:xfrm>
                       <a:off x="0" y="0"/>
-                      <a:ext cx="5029200" cy="15600460"/>
+                      <a:ext cx="5029200" cy="15612387"/>
                     </a:xfrm>
                     <a:prstGeom prst="rect"/>
                   </pic:spPr>
@@ -755,14 +755,14 @@
     </w:p>
     <w:p>
       <w:r>
-        <w:t>Timestamp: 2026-10-11 22:58:59</w:t>
+        <w:t>Timestamp: 2026-10-30 00:21:23</w:t>
       </w:r>
     </w:p>
     <w:p>
       <w:r>
         <w:drawing>
           <wp:inline xmlns:a="http://schemas.openxmlformats.org/drawingml/2006/main" xmlns:pic="http://schemas.openxmlformats.org/drawingml/2006/picture">
-            <wp:extent cx="5029200" cy="15624314"/>
+            <wp:extent cx="5029200" cy="15636241"/>
             <wp:docPr id="16" name="Picture 16"/>
             <wp:cNvGraphicFramePr>
               <a:graphicFrameLocks noChangeAspect="1"/>
@@ -771,7 +771,7 @@
               <a:graphicData uri="http://schemas.openxmlformats.org/drawingml/2006/picture">
                 <pic:pic>
                   <pic:nvPicPr>
-                    <pic:cNvPr id="0" name="16_checkout_page_payment_details_completed_2026-10-11_22-58-59.png"/>
+                    <pic:cNvPr id="0" name="16_checkout_page_payment_details_completed_2026-10-30_00-21-23.png"/>
                     <pic:cNvPicPr/>
                   </pic:nvPicPr>
                   <pic:blipFill>
@@ -783,7 +783,7 @@
                   <pic:spPr>
                     <a:xfrm>
                       <a:off x="0" y="0"/>
-                      <a:ext cx="5029200" cy="15624314"/>
+                      <a:ext cx="5029200" cy="15636241"/>
                     </a:xfrm>
                     <a:prstGeom prst="rect"/>
                   </pic:spPr>
@@ -804,14 +804,14 @@
     </w:p>
     <w:p>
       <w:r>
-        <w:t>Timestamp: 2026-10-11 22:59:06</w:t>
+        <w:t>Timestamp: 2026-10-30 00:21:30</w:t>
       </w:r>
     </w:p>
     <w:p>
       <w:r>
         <w:drawing>
           <wp:inline xmlns:a="http://schemas.openxmlformats.org/drawingml/2006/main" xmlns:pic="http://schemas.openxmlformats.org/drawingml/2006/picture">
-            <wp:extent cx="5029200" cy="16093441"/>
+            <wp:extent cx="5029200" cy="16105368"/>
             <wp:docPr id="17" name="Picture 17"/>
             <wp:cNvGraphicFramePr>
               <a:graphicFrameLocks noChangeAspect="1"/>
@@ -820,7 +820,7 @@
               <a:graphicData uri="http://schemas.openxmlformats.org/drawingml/2006/picture">
                 <pic:pic>
                   <pic:nvPicPr>
-                    <pic:cNvPr id="0" name="17_checkout_page_checkout_completed_2026-10-11_22-59-06.png"/>
+                    <pic:cNvPr id="0" name="17_checkout_page_checkout_completed_2026-10-30_00-21-30.png"/>
                     <pic:cNvPicPr/>
                   </pic:nvPicPr>
                   <pic:blipFill>
@@ -832,7 +832,7 @@
                   <pic:spPr>
                     <a:xfrm>
                       <a:off x="0" y="0"/>
-                      <a:ext cx="5029200" cy="16093441"/>
+                      <a:ext cx="5029200" cy="16105368"/>
                     </a:xfrm>
                     <a:prstGeom prst="rect"/>
                   </pic:spPr>

</xml_diff>